<commit_message>
fix negative restimate time
</commit_message>
<xml_diff>
--- a/Planning Document.docx
+++ b/Planning Document.docx
@@ -251,88 +251,64 @@
         <w:t>.</w:t>
       </w:r>
       <w:r>
-        <w:t xml:space="preserve"> User input includes “</w:t>
-      </w:r>
-      <w:r>
-        <w:t>What Bus Route would you like to</w:t>
+        <w:t xml:space="preserve"> User input includes “What Bus Route would you like to take?”, “What is your start and end stop on the route?”, “</w:t>
+      </w:r>
+      <w:r>
+        <w:t>What date will you take the route?</w:t>
+      </w:r>
+      <w:r>
+        <w:t>” and “</w:t>
+      </w:r>
+      <w:r>
+        <w:t>What time will you leave?</w:t>
+      </w:r>
+      <w:r>
+        <w:t>”.</w:t>
+      </w:r>
+      <w:r>
+        <w:t xml:space="preserve"> After receiving all inputs from user, the app will output the table of route’s short name and long name, trip’s service Id and head sign, </w:t>
+      </w:r>
+      <w:r>
+        <w:t xml:space="preserve">scheduled arrival time </w:t>
+      </w:r>
+      <w:r>
+        <w:t xml:space="preserve">and </w:t>
+      </w:r>
+      <w:r>
+        <w:t>live arrival time of the vehicle at the starting stop</w:t>
+      </w:r>
+      <w:r>
+        <w:t xml:space="preserve">, </w:t>
+      </w:r>
+      <w:r>
+        <w:t>live geographic position of vehicle</w:t>
+      </w:r>
+      <w:r>
+        <w:t xml:space="preserve"> and finally the e</w:t>
+      </w:r>
+      <w:r>
+        <w:t>stimated time</w:t>
+      </w:r>
+      <w:r>
+        <w:t xml:space="preserve"> from the start stop</w:t>
+      </w:r>
+      <w:r>
+        <w:t xml:space="preserve"> to destination sto</w:t>
+      </w:r>
+      <w:r>
+        <w:t>p.</w:t>
       </w:r>
       <w:r>
         <w:t xml:space="preserve"> </w:t>
       </w:r>
       <w:r>
-        <w:t>take?</w:t>
-      </w:r>
-      <w:r>
-        <w:t>”, “</w:t>
-      </w:r>
-      <w:r>
-        <w:t>What is your start and end stop on</w:t>
-      </w:r>
-      <w:r>
-        <w:t xml:space="preserve"> </w:t>
-      </w:r>
-      <w:r>
-        <w:t>the route?</w:t>
-      </w:r>
-      <w:r>
-        <w:t>”, “</w:t>
-      </w:r>
-      <w:r>
-        <w:t>What date will you take the route?</w:t>
-      </w:r>
-      <w:r>
-        <w:t>” and “</w:t>
-      </w:r>
-      <w:r>
-        <w:t>What time will you leave?</w:t>
-      </w:r>
-      <w:r>
-        <w:t>”.</w:t>
-      </w:r>
-      <w:r>
-        <w:t xml:space="preserve"> After receiving all inputs from user, the app will output the table of route’s short name and long name, trip’s service Id and head sign, </w:t>
-      </w:r>
-      <w:r>
-        <w:t xml:space="preserve">scheduled arrival time </w:t>
-      </w:r>
-      <w:r>
-        <w:t xml:space="preserve">and </w:t>
-      </w:r>
-      <w:r>
-        <w:t>live arrival time of the vehicle at the starting stop</w:t>
-      </w:r>
-      <w:r>
-        <w:t xml:space="preserve">, </w:t>
-      </w:r>
-      <w:r>
-        <w:t>live geographic position of vehicle</w:t>
-      </w:r>
-      <w:r>
-        <w:t xml:space="preserve"> and finally the e</w:t>
-      </w:r>
-      <w:r>
-        <w:t>stimated time</w:t>
-      </w:r>
-      <w:r>
-        <w:t xml:space="preserve"> from the start stop</w:t>
-      </w:r>
-      <w:r>
-        <w:t xml:space="preserve"> to destination sto</w:t>
-      </w:r>
-      <w:r>
-        <w:t>p.</w:t>
-      </w:r>
-      <w:r>
-        <w:t xml:space="preserve"> </w:t>
-      </w:r>
-      <w:r>
         <w:t>The app also allow user to search again and handling edge cases.</w:t>
       </w:r>
     </w:p>
     <w:p>
       <w:r>
         <w:pict w14:anchorId="6B01D344">
-          <v:rect id="_x0000_i1053" style="width:0;height:1.5pt" o:hralign="center" o:hrstd="t" o:hr="t" fillcolor="#a0a0a0" stroked="f"/>
+          <v:rect id="_x0000_i1025" style="width:0;height:1.5pt" o:hralign="center" o:hrstd="t" o:hr="t" fillcolor="#a0a0a0" stroked="f"/>
         </w:pict>
       </w:r>
     </w:p>
@@ -550,7 +526,7 @@
     <w:p>
       <w:r>
         <w:pict w14:anchorId="4012C5C6">
-          <v:rect id="_x0000_i1044" style="width:0;height:1.5pt" o:hralign="center" o:hrstd="t" o:hr="t" fillcolor="#a0a0a0" stroked="f"/>
+          <v:rect id="_x0000_i1026" style="width:0;height:1.5pt" o:hralign="center" o:hrstd="t" o:hr="t" fillcolor="#a0a0a0" stroked="f"/>
         </w:pict>
       </w:r>
     </w:p>
@@ -622,16 +598,7 @@
       </w:r>
       <w:proofErr w:type="spellEnd"/>
       <w:r>
-        <w:t xml:space="preserve"> that can </w:t>
-      </w:r>
-      <w:r>
-        <w:t xml:space="preserve">load a CSV </w:t>
-      </w:r>
-      <w:r>
-        <w:t>file</w:t>
-      </w:r>
-      <w:r>
-        <w:t xml:space="preserve"> into a </w:t>
+        <w:t xml:space="preserve"> that can load a CSV file into a </w:t>
       </w:r>
       <w:proofErr w:type="spellStart"/>
       <w:r>
@@ -639,25 +606,7 @@
       </w:r>
       <w:proofErr w:type="spellEnd"/>
       <w:r>
-        <w:t xml:space="preserve">, join two CSV </w:t>
-      </w:r>
-      <w:r>
-        <w:t>files</w:t>
-      </w:r>
-      <w:r>
-        <w:t xml:space="preserve"> on a common </w:t>
-      </w:r>
-      <w:r>
-        <w:t>field</w:t>
-      </w:r>
-      <w:r>
-        <w:t>, select spec</w:t>
-      </w:r>
-      <w:r>
-        <w:t>ific</w:t>
-      </w:r>
-      <w:r>
-        <w:t xml:space="preserve"> columns from a </w:t>
+        <w:t xml:space="preserve">, join two CSV files on a common field, select specific columns from a </w:t>
       </w:r>
       <w:proofErr w:type="spellStart"/>
       <w:r>
@@ -665,19 +614,7 @@
       </w:r>
       <w:proofErr w:type="spellEnd"/>
       <w:r>
-        <w:t>, return</w:t>
-      </w:r>
-      <w:r>
-        <w:t xml:space="preserve"> </w:t>
-      </w:r>
-      <w:r>
-        <w:t xml:space="preserve">distinct values from a column and </w:t>
-      </w:r>
-      <w:r>
-        <w:t>filter</w:t>
-      </w:r>
-      <w:r>
-        <w:t xml:space="preserve"> columns of a </w:t>
+        <w:t xml:space="preserve">, return distinct values from a column and filter columns of a </w:t>
       </w:r>
       <w:proofErr w:type="spellStart"/>
       <w:r>
@@ -714,7 +651,21 @@
         </w:numPr>
       </w:pPr>
       <w:r>
-        <w:t>Load and parse the GTFS .txt files into appropriate data structures.</w:t>
+        <w:t>Load and parse the GTFS .txt files into</w:t>
+      </w:r>
+      <w:r>
+        <w:t xml:space="preserve"> different</w:t>
+      </w:r>
+      <w:r>
+        <w:t xml:space="preserve"> </w:t>
+      </w:r>
+      <w:proofErr w:type="spellStart"/>
+      <w:r>
+        <w:t>dataframes</w:t>
+      </w:r>
+      <w:proofErr w:type="spellEnd"/>
+      <w:r>
+        <w:t>.</w:t>
       </w:r>
     </w:p>
     <w:p>
@@ -1062,7 +1013,7 @@
       </w:pPr>
       <w:r>
         <w:pict w14:anchorId="2B3A1054">
-          <v:rect id="_x0000_i1045" style="width:0;height:1.5pt" o:hralign="center" o:hrstd="t" o:hr="t" fillcolor="#a0a0a0" stroked="f"/>
+          <v:rect id="_x0000_i1027" style="width:0;height:1.5pt" o:hralign="center" o:hrstd="t" o:hr="t" fillcolor="#a0a0a0" stroked="f"/>
         </w:pict>
       </w:r>
     </w:p>
@@ -3655,6 +3606,7 @@
   <w:style w:type="character" w:default="1" w:styleId="DefaultParagraphFont">
     <w:name w:val="Default Paragraph Font"/>
     <w:uiPriority w:val="1"/>
+    <w:semiHidden/>
     <w:unhideWhenUsed/>
   </w:style>
   <w:style w:type="table" w:default="1" w:styleId="TableNormal">

</xml_diff>

<commit_message>
create tests, convert live arrival time to AEST
</commit_message>
<xml_diff>
--- a/Planning Document.docx
+++ b/Planning Document.docx
@@ -473,10 +473,10 @@
                 <w:noProof/>
               </w:rPr>
               <w:drawing>
-                <wp:inline distT="0" distB="0" distL="0" distR="0" wp14:anchorId="55EB9178" wp14:editId="4D8376AA">
-                  <wp:extent cx="5334000" cy="6005879"/>
-                  <wp:effectExtent l="0" t="0" r="0" b="0"/>
-                  <wp:docPr id="1714706526" name="Graphic 1"/>
+                <wp:inline distT="0" distB="0" distL="0" distR="0" wp14:anchorId="709CA5D9" wp14:editId="0254A0E6">
+                  <wp:extent cx="5311140" cy="5980140"/>
+                  <wp:effectExtent l="0" t="0" r="3810" b="1905"/>
+                  <wp:docPr id="1456535616" name="Graphic 1"/>
                   <wp:cNvGraphicFramePr>
                     <a:graphicFrameLocks xmlns:a="http://schemas.openxmlformats.org/drawingml/2006/main" noChangeAspect="1"/>
                   </wp:cNvGraphicFramePr>
@@ -484,7 +484,7 @@
                     <a:graphicData uri="http://schemas.openxmlformats.org/drawingml/2006/picture">
                       <pic:pic xmlns:pic="http://schemas.openxmlformats.org/drawingml/2006/picture">
                         <pic:nvPicPr>
-                          <pic:cNvPr id="1714706526" name="Graphic 1714706526"/>
+                          <pic:cNvPr id="1456535616" name="Graphic 1456535616"/>
                           <pic:cNvPicPr/>
                         </pic:nvPicPr>
                         <pic:blipFill>
@@ -502,7 +502,7 @@
                         <pic:spPr>
                           <a:xfrm>
                             <a:off x="0" y="0"/>
-                            <a:ext cx="5336533" cy="6008731"/>
+                            <a:ext cx="5320882" cy="5991109"/>
                           </a:xfrm>
                           <a:prstGeom prst="rect">
                             <a:avLst/>
@@ -846,14 +846,127 @@
     </w:p>
     <w:p>
       <w:pPr>
+        <w:ind w:left="720"/>
+      </w:pPr>
+      <w:r>
+        <w:t>-            Static data:</w:t>
+      </w:r>
+    </w:p>
+    <w:p>
+      <w:pPr>
+        <w:ind w:left="720"/>
+      </w:pPr>
+      <w:r>
+        <w:t xml:space="preserve">To get a list of all stops from start stop to end stop, I filter the copy of trips based on </w:t>
+      </w:r>
+      <w:proofErr w:type="spellStart"/>
+      <w:r>
+        <w:t>route_id</w:t>
+      </w:r>
+      <w:proofErr w:type="spellEnd"/>
+      <w:r>
+        <w:t xml:space="preserve"> (found in find in route </w:t>
+      </w:r>
+      <w:proofErr w:type="spellStart"/>
+      <w:r>
+        <w:t>dataframe</w:t>
+      </w:r>
+      <w:proofErr w:type="spellEnd"/>
+      <w:r>
+        <w:t xml:space="preserve"> and from user input route short name) and </w:t>
+      </w:r>
+      <w:proofErr w:type="spellStart"/>
+      <w:r>
+        <w:t>direction_id</w:t>
+      </w:r>
+      <w:proofErr w:type="spellEnd"/>
+      <w:r>
+        <w:t xml:space="preserve"> (for inbound and outbound trips). Following that, I filter </w:t>
+      </w:r>
+      <w:proofErr w:type="spellStart"/>
+      <w:r>
+        <w:t>stop_times</w:t>
+      </w:r>
+      <w:proofErr w:type="spellEnd"/>
+      <w:r>
+        <w:t xml:space="preserve"> based on all the </w:t>
+      </w:r>
+      <w:proofErr w:type="spellStart"/>
+      <w:r>
+        <w:t>trip_id</w:t>
+      </w:r>
+      <w:proofErr w:type="spellEnd"/>
+      <w:r>
+        <w:t xml:space="preserve"> found in inbound and outbound trips separately, sort the returns based on </w:t>
+      </w:r>
+      <w:proofErr w:type="spellStart"/>
+      <w:r>
+        <w:t>stop_sequence</w:t>
+      </w:r>
+      <w:proofErr w:type="spellEnd"/>
+      <w:r>
+        <w:t xml:space="preserve"> and map them with stops using </w:t>
+      </w:r>
+      <w:proofErr w:type="spellStart"/>
+      <w:r>
+        <w:t>stop_id</w:t>
+      </w:r>
+      <w:proofErr w:type="spellEnd"/>
+      <w:r>
+        <w:t xml:space="preserve"> to extract the name of each stop. After that, using Set constructor to make each of the name list unique, </w:t>
+      </w:r>
+      <w:proofErr w:type="spellStart"/>
+      <w:r>
+        <w:t>concat</w:t>
+      </w:r>
+      <w:proofErr w:type="spellEnd"/>
+      <w:r>
+        <w:t xml:space="preserve"> them if needed and return.</w:t>
+      </w:r>
+    </w:p>
+    <w:p>
+      <w:pPr>
+        <w:ind w:left="720"/>
+      </w:pPr>
+      <w:r>
+        <w:t xml:space="preserve">To get the table of route short name and long name, trips service ID and head sign, scheduled arrival time and estimated time to destination stop, I  </w:t>
+      </w:r>
+    </w:p>
+    <w:p>
+      <w:pPr>
         <w:pStyle w:val="ListParagraph"/>
         <w:numPr>
-          <w:ilvl w:val="1"/>
-          <w:numId w:val="10"/>
-        </w:numPr>
-      </w:pPr>
-      <w:r>
-        <w:t xml:space="preserve">Join the static datasets on </w:t>
+          <w:ilvl w:val="2"/>
+          <w:numId w:val="4"/>
+        </w:numPr>
+      </w:pPr>
+      <w:r>
+        <w:t xml:space="preserve">Filtered trips based on </w:t>
+      </w:r>
+      <w:proofErr w:type="spellStart"/>
+      <w:r>
+        <w:t>direction_id</w:t>
+      </w:r>
+      <w:proofErr w:type="spellEnd"/>
+    </w:p>
+    <w:p>
+      <w:pPr>
+        <w:pStyle w:val="ListParagraph"/>
+        <w:numPr>
+          <w:ilvl w:val="2"/>
+          <w:numId w:val="4"/>
+        </w:numPr>
+      </w:pPr>
+      <w:r>
+        <w:t xml:space="preserve">calendar and </w:t>
+      </w:r>
+      <w:proofErr w:type="spellStart"/>
+      <w:r>
+        <w:t>calendar_dates</w:t>
+      </w:r>
+      <w:proofErr w:type="spellEnd"/>
+      <w:r>
+        <w:t xml:space="preserve"> based on </w:t>
       </w:r>
       <w:proofErr w:type="spellStart"/>
       <w:r>
@@ -861,15 +974,119 @@
       </w:r>
       <w:proofErr w:type="spellEnd"/>
       <w:r>
+        <w:t xml:space="preserve"> (called D)</w:t>
+      </w:r>
+    </w:p>
+    <w:p>
+      <w:pPr>
+        <w:pStyle w:val="ListParagraph"/>
+        <w:numPr>
+          <w:ilvl w:val="2"/>
+          <w:numId w:val="4"/>
+        </w:numPr>
+      </w:pPr>
+      <w:r>
+        <w:t xml:space="preserve">Filtered D with </w:t>
+      </w:r>
+      <w:proofErr w:type="spellStart"/>
+      <w:r>
+        <w:t>exception_type</w:t>
+      </w:r>
+      <w:proofErr w:type="spellEnd"/>
+      <w:r>
+        <w:t xml:space="preserve"> (in </w:t>
+      </w:r>
+      <w:proofErr w:type="spellStart"/>
+      <w:r>
+        <w:t>calendar_dates</w:t>
+      </w:r>
+      <w:proofErr w:type="spellEnd"/>
+      <w:r>
+        <w:t xml:space="preserve">), </w:t>
+      </w:r>
+      <w:proofErr w:type="spellStart"/>
+      <w:r>
+        <w:t>dayOfWeek</w:t>
+      </w:r>
+      <w:proofErr w:type="spellEnd"/>
+      <w:r>
         <w:t xml:space="preserve">, </w:t>
       </w:r>
       <w:proofErr w:type="spellStart"/>
       <w:r>
+        <w:t>start_date</w:t>
+      </w:r>
+      <w:proofErr w:type="spellEnd"/>
+      <w:r>
+        <w:t xml:space="preserve"> and </w:t>
+      </w:r>
+      <w:proofErr w:type="spellStart"/>
+      <w:r>
+        <w:t>end_date</w:t>
+      </w:r>
+      <w:proofErr w:type="spellEnd"/>
+      <w:r>
+        <w:t xml:space="preserve"> (in calendar).</w:t>
+      </w:r>
+    </w:p>
+    <w:p>
+      <w:pPr>
+        <w:pStyle w:val="ListParagraph"/>
+        <w:numPr>
+          <w:ilvl w:val="2"/>
+          <w:numId w:val="4"/>
+        </w:numPr>
+      </w:pPr>
+      <w:r>
+        <w:t xml:space="preserve">Filtered stops with </w:t>
+      </w:r>
+      <w:proofErr w:type="spellStart"/>
+      <w:r>
+        <w:t>stop_name</w:t>
+      </w:r>
+      <w:proofErr w:type="spellEnd"/>
+      <w:r>
+        <w:t xml:space="preserve"> using start and end stops that user input.</w:t>
+      </w:r>
+    </w:p>
+    <w:p>
+      <w:pPr>
+        <w:pStyle w:val="ListParagraph"/>
+        <w:numPr>
+          <w:ilvl w:val="2"/>
+          <w:numId w:val="4"/>
+        </w:numPr>
+      </w:pPr>
+      <w:r>
+        <w:t xml:space="preserve">Joined routes with trips based on </w:t>
+      </w:r>
+      <w:proofErr w:type="spellStart"/>
+      <w:r>
         <w:t>route_id</w:t>
       </w:r>
       <w:proofErr w:type="spellEnd"/>
       <w:r>
-        <w:t xml:space="preserve">, </w:t>
+        <w:t xml:space="preserve"> (called A)</w:t>
+      </w:r>
+    </w:p>
+    <w:p>
+      <w:pPr>
+        <w:pStyle w:val="ListParagraph"/>
+        <w:numPr>
+          <w:ilvl w:val="2"/>
+          <w:numId w:val="4"/>
+        </w:numPr>
+      </w:pPr>
+      <w:r>
+        <w:t xml:space="preserve">Joined A with </w:t>
+      </w:r>
+      <w:proofErr w:type="spellStart"/>
+      <w:r>
+        <w:t>stop_times</w:t>
+      </w:r>
+      <w:proofErr w:type="spellEnd"/>
+      <w:r>
+        <w:t xml:space="preserve"> based on </w:t>
       </w:r>
       <w:proofErr w:type="spellStart"/>
       <w:r>
@@ -877,27 +1094,111 @@
       </w:r>
       <w:proofErr w:type="spellEnd"/>
       <w:r>
-        <w:t xml:space="preserve">, and </w:t>
-      </w:r>
-      <w:proofErr w:type="spellStart"/>
-      <w:r>
-        <w:t>stop_id</w:t>
-      </w:r>
-      <w:proofErr w:type="spellEnd"/>
-      <w:r>
-        <w:t xml:space="preserve"> as needed to create a cohesive view of the transit data.</w:t>
+        <w:t xml:space="preserve"> (called B)</w:t>
       </w:r>
     </w:p>
     <w:p>
       <w:pPr>
         <w:pStyle w:val="ListParagraph"/>
         <w:numPr>
-          <w:ilvl w:val="1"/>
-          <w:numId w:val="10"/>
-        </w:numPr>
-      </w:pPr>
-      <w:r>
-        <w:t xml:space="preserve">Merge the live data by joining on </w:t>
+          <w:ilvl w:val="2"/>
+          <w:numId w:val="4"/>
+        </w:numPr>
+      </w:pPr>
+      <w:r>
+        <w:t xml:space="preserve">Joined B with stops by </w:t>
+      </w:r>
+      <w:proofErr w:type="spellStart"/>
+      <w:r>
+        <w:t>stop_</w:t>
+      </w:r>
+      <w:proofErr w:type="gramStart"/>
+      <w:r>
+        <w:t>id</w:t>
+      </w:r>
+      <w:proofErr w:type="spellEnd"/>
+      <w:r>
+        <w:t xml:space="preserve">  (</w:t>
+      </w:r>
+      <w:proofErr w:type="gramEnd"/>
+      <w:r>
+        <w:t>called C)</w:t>
+      </w:r>
+    </w:p>
+    <w:p>
+      <w:pPr>
+        <w:pStyle w:val="ListParagraph"/>
+        <w:numPr>
+          <w:ilvl w:val="2"/>
+          <w:numId w:val="4"/>
+        </w:numPr>
+      </w:pPr>
+      <w:r>
+        <w:t xml:space="preserve">Joined C joined with D based on </w:t>
+      </w:r>
+      <w:proofErr w:type="spellStart"/>
+      <w:r>
+        <w:t>service_id</w:t>
+      </w:r>
+      <w:proofErr w:type="spellEnd"/>
+      <w:r>
+        <w:t xml:space="preserve"> (called </w:t>
+      </w:r>
+      <w:proofErr w:type="spellStart"/>
+      <w:r>
+        <w:t>finalDF</w:t>
+      </w:r>
+      <w:proofErr w:type="spellEnd"/>
+      <w:r>
+        <w:t>)</w:t>
+      </w:r>
+    </w:p>
+    <w:p>
+      <w:pPr>
+        <w:pStyle w:val="ListParagraph"/>
+        <w:numPr>
+          <w:ilvl w:val="2"/>
+          <w:numId w:val="4"/>
+        </w:numPr>
+      </w:pPr>
+      <w:r>
+        <w:t xml:space="preserve">Extract all objects from </w:t>
+      </w:r>
+      <w:proofErr w:type="spellStart"/>
+      <w:r>
+        <w:t>finalDF</w:t>
+      </w:r>
+      <w:proofErr w:type="spellEnd"/>
+      <w:r>
+        <w:t xml:space="preserve"> that have </w:t>
+      </w:r>
+      <w:proofErr w:type="spellStart"/>
+      <w:r>
+        <w:t>arrival_time</w:t>
+      </w:r>
+      <w:proofErr w:type="spellEnd"/>
+      <w:r>
+        <w:t xml:space="preserve"> of all start stops based on the times’ difference (less than 10 minutes constraint).</w:t>
+      </w:r>
+    </w:p>
+    <w:p>
+      <w:pPr>
+        <w:pStyle w:val="ListParagraph"/>
+        <w:numPr>
+          <w:ilvl w:val="2"/>
+          <w:numId w:val="4"/>
+        </w:numPr>
+      </w:pPr>
+      <w:r>
+        <w:t xml:space="preserve">Paired with </w:t>
+      </w:r>
+      <w:proofErr w:type="spellStart"/>
+      <w:r>
+        <w:t>arrival_time</w:t>
+      </w:r>
+      <w:proofErr w:type="spellEnd"/>
+      <w:r>
+        <w:t xml:space="preserve"> of destination stop based on stop name and </w:t>
       </w:r>
       <w:proofErr w:type="spellStart"/>
       <w:r>
@@ -905,7 +1206,88 @@
       </w:r>
       <w:proofErr w:type="spellEnd"/>
       <w:r>
-        <w:t xml:space="preserve"> and updating the static data with real-time information.</w:t>
+        <w:t>.</w:t>
+      </w:r>
+    </w:p>
+    <w:p>
+      <w:pPr>
+        <w:ind w:left="720"/>
+      </w:pPr>
+      <w:r>
+        <w:lastRenderedPageBreak/>
+        <w:t>-            Live data:</w:t>
+      </w:r>
+    </w:p>
+    <w:p>
+      <w:pPr>
+        <w:ind w:left="720"/>
+      </w:pPr>
+      <w:r>
+        <w:t>To get live data of bus arrival time and position, I</w:t>
+      </w:r>
+    </w:p>
+    <w:p>
+      <w:pPr>
+        <w:pStyle w:val="ListParagraph"/>
+        <w:numPr>
+          <w:ilvl w:val="2"/>
+          <w:numId w:val="4"/>
+        </w:numPr>
+      </w:pPr>
+      <w:r>
+        <w:t xml:space="preserve">Filtered </w:t>
+      </w:r>
+      <w:proofErr w:type="spellStart"/>
+      <w:r>
+        <w:t>trip_updates</w:t>
+      </w:r>
+      <w:proofErr w:type="spellEnd"/>
+      <w:r>
+        <w:t xml:space="preserve"> based on each </w:t>
+      </w:r>
+      <w:proofErr w:type="spellStart"/>
+      <w:proofErr w:type="gramStart"/>
+      <w:r>
+        <w:t>entity</w:t>
+      </w:r>
+      <w:r>
+        <w:t>.tripUpdate.trip</w:t>
+      </w:r>
+      <w:proofErr w:type="gramEnd"/>
+      <w:r>
+        <w:t>.tripId</w:t>
+      </w:r>
+      <w:proofErr w:type="spellEnd"/>
+      <w:r>
+        <w:t xml:space="preserve"> with </w:t>
+      </w:r>
+      <w:proofErr w:type="spellStart"/>
+      <w:r>
+        <w:t>trip_id</w:t>
+      </w:r>
+      <w:proofErr w:type="spellEnd"/>
+      <w:r>
+        <w:t xml:space="preserve"> of </w:t>
+      </w:r>
+      <w:proofErr w:type="spellStart"/>
+      <w:r>
+        <w:t>finalDF</w:t>
+      </w:r>
+      <w:proofErr w:type="spellEnd"/>
+      <w:r>
+        <w:t>.</w:t>
+      </w:r>
+    </w:p>
+    <w:p>
+      <w:pPr>
+        <w:pStyle w:val="ListParagraph"/>
+        <w:numPr>
+          <w:ilvl w:val="2"/>
+          <w:numId w:val="4"/>
+        </w:numPr>
+      </w:pPr>
+      <w:r>
+        <w:t xml:space="preserve"> </w:t>
       </w:r>
     </w:p>
     <w:p>
@@ -920,87 +1302,10 @@
           <w:b/>
           <w:bCs/>
         </w:rPr>
-        <w:t>Develop the Application</w:t>
+        <w:t>Testing</w:t>
       </w:r>
       <w:r>
         <w:t>:</w:t>
-      </w:r>
-    </w:p>
-    <w:p>
-      <w:pPr>
-        <w:pStyle w:val="ListParagraph"/>
-        <w:numPr>
-          <w:ilvl w:val="1"/>
-          <w:numId w:val="11"/>
-        </w:numPr>
-      </w:pPr>
-      <w:r>
-        <w:t>Implement a user interface for querying routes, stops, and trips.</w:t>
-      </w:r>
-    </w:p>
-    <w:p>
-      <w:pPr>
-        <w:pStyle w:val="ListParagraph"/>
-        <w:numPr>
-          <w:ilvl w:val="1"/>
-          <w:numId w:val="11"/>
-        </w:numPr>
-      </w:pPr>
-      <w:r>
-        <w:t>Provide real-time updates by incorporating the parsed live data.</w:t>
-      </w:r>
-    </w:p>
-    <w:p>
-      <w:pPr>
-        <w:pStyle w:val="ListParagraph"/>
-        <w:numPr>
-          <w:ilvl w:val="1"/>
-          <w:numId w:val="11"/>
-        </w:numPr>
-      </w:pPr>
-      <w:r>
-        <w:t>Display results clearly, such as showing current vehicle positions on a map or listing service alerts.</w:t>
-      </w:r>
-    </w:p>
-    <w:p>
-      <w:pPr>
-        <w:numPr>
-          <w:ilvl w:val="0"/>
-          <w:numId w:val="4"/>
-        </w:numPr>
-      </w:pPr>
-      <w:r>
-        <w:rPr>
-          <w:b/>
-          <w:bCs/>
-        </w:rPr>
-        <w:t>Testing</w:t>
-      </w:r>
-      <w:r>
-        <w:t>:</w:t>
-      </w:r>
-    </w:p>
-    <w:p>
-      <w:pPr>
-        <w:numPr>
-          <w:ilvl w:val="1"/>
-          <w:numId w:val="12"/>
-        </w:numPr>
-      </w:pPr>
-      <w:r>
-        <w:t>Using Jest to v</w:t>
-      </w:r>
-      <w:r>
-        <w:t>alidate the data joins</w:t>
-      </w:r>
-      <w:r>
-        <w:t>,</w:t>
-      </w:r>
-      <w:r>
-        <w:t xml:space="preserve"> ensure accuracy in the real-time information displaye</w:t>
-      </w:r>
-      <w:r>
-        <w:t>d and edge cases covered.</w:t>
       </w:r>
     </w:p>
     <w:p>
@@ -1145,7 +1450,6 @@
           <w:b/>
           <w:bCs/>
         </w:rPr>
-        <w:lastRenderedPageBreak/>
         <w:t>parse from csv-parse: For parsing CSV data into JSON format.</w:t>
       </w:r>
     </w:p>
@@ -2243,7 +2547,7 @@
   <w:abstractNum w:abstractNumId="8" w15:restartNumberingAfterBreak="0">
     <w:nsid w:val="525837F4"/>
     <w:multiLevelType w:val="multilevel"/>
-    <w:tmpl w:val="950EA3EC"/>
+    <w:tmpl w:val="AB346C6E"/>
     <w:lvl w:ilvl="0">
       <w:start w:val="1"/>
       <w:numFmt w:val="decimal"/>
@@ -2272,17 +2576,16 @@
         <w:sz w:val="20"/>
       </w:rPr>
     </w:lvl>
-    <w:lvl w:ilvl="2" w:tentative="1">
-      <w:start w:val="1"/>
-      <w:numFmt w:val="decimal"/>
-      <w:lvlText w:val="%3."/>
-      <w:lvlJc w:val="left"/>
-      <w:pPr>
-        <w:tabs>
-          <w:tab w:val="num" w:pos="2160"/>
-        </w:tabs>
+    <w:lvl w:ilvl="2">
+      <w:numFmt w:val="bullet"/>
+      <w:lvlText w:val="-"/>
+      <w:lvlJc w:val="left"/>
+      <w:pPr>
         <w:ind w:left="2160" w:hanging="360"/>
       </w:pPr>
+      <w:rPr>
+        <w:rFonts w:ascii="Aptos" w:eastAsiaTheme="minorHAnsi" w:hAnsi="Aptos" w:cstheme="minorBidi" w:hint="default"/>
+      </w:rPr>
     </w:lvl>
     <w:lvl w:ilvl="3" w:tentative="1">
       <w:start w:val="1"/>
@@ -2956,6 +3259,119 @@
         </w:tabs>
         <w:ind w:left="6480" w:hanging="360"/>
       </w:pPr>
+    </w:lvl>
+  </w:abstractNum>
+  <w:abstractNum w:abstractNumId="14" w15:restartNumberingAfterBreak="0">
+    <w:nsid w:val="7CE94E5D"/>
+    <w:multiLevelType w:val="hybridMultilevel"/>
+    <w:tmpl w:val="F75E94EA"/>
+    <w:lvl w:ilvl="0" w:tplc="08090001">
+      <w:start w:val="1"/>
+      <w:numFmt w:val="bullet"/>
+      <w:lvlText w:val=""/>
+      <w:lvlJc w:val="left"/>
+      <w:pPr>
+        <w:ind w:left="1440" w:hanging="360"/>
+      </w:pPr>
+      <w:rPr>
+        <w:rFonts w:ascii="Symbol" w:hAnsi="Symbol" w:hint="default"/>
+      </w:rPr>
+    </w:lvl>
+    <w:lvl w:ilvl="1" w:tplc="08090003" w:tentative="1">
+      <w:start w:val="1"/>
+      <w:numFmt w:val="bullet"/>
+      <w:lvlText w:val="o"/>
+      <w:lvlJc w:val="left"/>
+      <w:pPr>
+        <w:ind w:left="2160" w:hanging="360"/>
+      </w:pPr>
+      <w:rPr>
+        <w:rFonts w:ascii="Courier New" w:hAnsi="Courier New" w:cs="Courier New" w:hint="default"/>
+      </w:rPr>
+    </w:lvl>
+    <w:lvl w:ilvl="2" w:tplc="08090005" w:tentative="1">
+      <w:start w:val="1"/>
+      <w:numFmt w:val="bullet"/>
+      <w:lvlText w:val=""/>
+      <w:lvlJc w:val="left"/>
+      <w:pPr>
+        <w:ind w:left="2880" w:hanging="360"/>
+      </w:pPr>
+      <w:rPr>
+        <w:rFonts w:ascii="Wingdings" w:hAnsi="Wingdings" w:hint="default"/>
+      </w:rPr>
+    </w:lvl>
+    <w:lvl w:ilvl="3" w:tplc="08090001" w:tentative="1">
+      <w:start w:val="1"/>
+      <w:numFmt w:val="bullet"/>
+      <w:lvlText w:val=""/>
+      <w:lvlJc w:val="left"/>
+      <w:pPr>
+        <w:ind w:left="3600" w:hanging="360"/>
+      </w:pPr>
+      <w:rPr>
+        <w:rFonts w:ascii="Symbol" w:hAnsi="Symbol" w:hint="default"/>
+      </w:rPr>
+    </w:lvl>
+    <w:lvl w:ilvl="4" w:tplc="08090003" w:tentative="1">
+      <w:start w:val="1"/>
+      <w:numFmt w:val="bullet"/>
+      <w:lvlText w:val="o"/>
+      <w:lvlJc w:val="left"/>
+      <w:pPr>
+        <w:ind w:left="4320" w:hanging="360"/>
+      </w:pPr>
+      <w:rPr>
+        <w:rFonts w:ascii="Courier New" w:hAnsi="Courier New" w:cs="Courier New" w:hint="default"/>
+      </w:rPr>
+    </w:lvl>
+    <w:lvl w:ilvl="5" w:tplc="08090005" w:tentative="1">
+      <w:start w:val="1"/>
+      <w:numFmt w:val="bullet"/>
+      <w:lvlText w:val=""/>
+      <w:lvlJc w:val="left"/>
+      <w:pPr>
+        <w:ind w:left="5040" w:hanging="360"/>
+      </w:pPr>
+      <w:rPr>
+        <w:rFonts w:ascii="Wingdings" w:hAnsi="Wingdings" w:hint="default"/>
+      </w:rPr>
+    </w:lvl>
+    <w:lvl w:ilvl="6" w:tplc="08090001" w:tentative="1">
+      <w:start w:val="1"/>
+      <w:numFmt w:val="bullet"/>
+      <w:lvlText w:val=""/>
+      <w:lvlJc w:val="left"/>
+      <w:pPr>
+        <w:ind w:left="5760" w:hanging="360"/>
+      </w:pPr>
+      <w:rPr>
+        <w:rFonts w:ascii="Symbol" w:hAnsi="Symbol" w:hint="default"/>
+      </w:rPr>
+    </w:lvl>
+    <w:lvl w:ilvl="7" w:tplc="08090003" w:tentative="1">
+      <w:start w:val="1"/>
+      <w:numFmt w:val="bullet"/>
+      <w:lvlText w:val="o"/>
+      <w:lvlJc w:val="left"/>
+      <w:pPr>
+        <w:ind w:left="6480" w:hanging="360"/>
+      </w:pPr>
+      <w:rPr>
+        <w:rFonts w:ascii="Courier New" w:hAnsi="Courier New" w:cs="Courier New" w:hint="default"/>
+      </w:rPr>
+    </w:lvl>
+    <w:lvl w:ilvl="8" w:tplc="08090005" w:tentative="1">
+      <w:start w:val="1"/>
+      <w:numFmt w:val="bullet"/>
+      <w:lvlText w:val=""/>
+      <w:lvlJc w:val="left"/>
+      <w:pPr>
+        <w:ind w:left="7200" w:hanging="360"/>
+      </w:pPr>
+      <w:rPr>
+        <w:rFonts w:ascii="Wingdings" w:hAnsi="Wingdings" w:hint="default"/>
+      </w:rPr>
     </w:lvl>
   </w:abstractNum>
   <w:num w:numId="1" w16cid:durableId="1043559898">
@@ -2999,6 +3415,9 @@
   </w:num>
   <w:num w:numId="14" w16cid:durableId="807479714">
     <w:abstractNumId w:val="11"/>
+  </w:num>
+  <w:num w:numId="15" w16cid:durableId="829949514">
+    <w:abstractNumId w:val="14"/>
   </w:num>
 </w:numbering>
 </file>
@@ -3606,7 +4025,6 @@
   <w:style w:type="character" w:default="1" w:styleId="DefaultParagraphFont">
     <w:name w:val="Default Paragraph Font"/>
     <w:uiPriority w:val="1"/>
-    <w:semiHidden/>
     <w:unhideWhenUsed/>
   </w:style>
   <w:style w:type="table" w:default="1" w:styleId="TableNormal">

</xml_diff>